<commit_message>
chore: cleanup — update gitignore, README, stage remaining files
- chore(.gitignore): add LaTeX build artifacts (*.bcf, *.run.xml,
  *.lof, *.lot) and one-off fix scripts to gitignore
- docs(README): rewrite to reflect current project state — 15-chapter
  structure, submission bundle, build instructions, design decisions
- chore(submission): update mentor2 MajorReport.docx
- chore(knowledge-base): add cais_deadline_context.md and
  word_doc_manual_updates.md
- chore(work-logs): add Aug 29-30 and Sep 2026 work log entries
</commit_message>
<xml_diff>
--- a/submission/mentor2/BhavikBhagat_A00494758_MajorReport.docx
+++ b/submission/mentor2/BhavikBhagat_A00494758_MajorReport.docx
@@ -1023,6 +1023,7 @@
     <w:sdt>
       <w:sdtPr>
         <w:rPr>
+          <w:b w:val="0"/>
           <w:color w:val="000000"/>
           <w:sz w:val="24"/>
           <w:szCs w:val="24"/>
@@ -1035,7 +1036,6 @@
       </w:sdtPr>
       <w:sdtEndPr>
         <w:rPr>
-          <w:b w:val="0"/>
           <w:bCs/>
         </w:rPr>
       </w:sdtEndPr>
@@ -32237,15 +32237,7 @@
         <w:t>ing</w:t>
       </w:r>
       <w:r>
-        <w:t xml:space="preserve"> was conducted by the Red Team on UAT only to protect production uptime); and the access logging infrastructure built on the ELK stack (Kibana, Elasticsearch) with 7–</w:t>
-      </w:r>
-      <w:proofErr w:type="gramStart"/>
-      <w:r>
-        <w:t>14 day</w:t>
-      </w:r>
-      <w:proofErr w:type="gramEnd"/>
-      <w:r>
-        <w:t xml:space="preserve"> log retention policies. I also learned about Dynatrace application monitoring for anomaly detection and alerting—knowledge that would become directly relevant when I later evaluated Dynatrace parity as a framing question for the Grafana AMG dashboard work.</w:t>
+        <w:t xml:space="preserve"> was conducted by the Red Team on UAT only to protect production uptime); and the access logging infrastructure built on the ELK stack (Kibana, Elasticsearch) with 7–14 day log retention policies. I also learned about Dynatrace application monitoring for anomaly detection and alerting—knowledge that would become directly relevant when I later evaluated Dynatrace parity as a framing question for the Grafana AMG dashboard work.</w:t>
       </w:r>
     </w:p>
     <w:p>
@@ -46001,7 +45993,13 @@
         <w:pStyle w:val="SubSection"/>
       </w:pPr>
       <w:r>
-        <w:t>A.0.1</w:t>
+        <w:t>A.0.</w:t>
+      </w:r>
+      <w:r>
+        <w:t>1</w:t>
+      </w:r>
+      <w:r>
+        <w:tab/>
       </w:r>
       <w:r>
         <w:t>WORK LOGS</w:t>
@@ -46153,7 +46151,13 @@
         <w:pStyle w:val="SubSection"/>
       </w:pPr>
       <w:r>
-        <w:t>A.0.2 Glossary of Terms and Abbreviations</w:t>
+        <w:t>A.0.2</w:t>
+      </w:r>
+      <w:r>
+        <w:tab/>
+      </w:r>
+      <w:r>
+        <w:t>Glossary of Terms and Abbreviations</w:t>
       </w:r>
     </w:p>
     <w:p>
@@ -48286,21 +48290,7 @@
                 <w:sz w:val="24"/>
                 <w:szCs w:val="24"/>
               </w:rPr>
-              <w:t xml:space="preserve">specific platform or cost </w:t>
-            </w:r>
-            <w:r>
-              <w:rPr>
-                <w:sz w:val="24"/>
-                <w:szCs w:val="24"/>
-              </w:rPr>
-              <w:t>center</w:t>
-            </w:r>
-            <w:r>
-              <w:rPr>
-                <w:sz w:val="24"/>
-                <w:szCs w:val="24"/>
-              </w:rPr>
-              <w:t xml:space="preserve"> (e.g., rpacfs1, ia‐bpo).</w:t>
+              <w:t>specific platform or cost center (e.g., rpacfs1, ia‐bpo).</w:t>
             </w:r>
           </w:p>
         </w:tc>
@@ -61068,6 +61058,7 @@
   <w:style w:type="character" w:default="1" w:styleId="DefaultParagraphFont">
     <w:name w:val="Default Paragraph Font"/>
     <w:uiPriority w:val="1"/>
+    <w:semiHidden/>
     <w:unhideWhenUsed/>
   </w:style>
   <w:style w:type="table" w:default="1" w:styleId="TableNormal">

</xml_diff>